<commit_message>
actualizacion del manual de usuario
</commit_message>
<xml_diff>
--- a/Documentos/Manual usuario sgpc.docx
+++ b/Documentos/Manual usuario sgpc.docx
@@ -17,12 +17,12 @@
           <wp:inline distB="114300" distT="114300" distL="114300" distR="114300">
             <wp:extent cx="5639753" cy="4250101"/>
             <wp:effectExtent b="0" l="0" r="0" t="0"/>
-            <wp:docPr id="4" name="image5.png"/>
+            <wp:docPr id="2" name="image6.png"/>
             <a:graphic>
               <a:graphicData uri="http://schemas.openxmlformats.org/drawingml/2006/picture">
                 <pic:pic>
                   <pic:nvPicPr>
-                    <pic:cNvPr id="0" name="image5.png"/>
+                    <pic:cNvPr id="0" name="image6.png"/>
                     <pic:cNvPicPr preferRelativeResize="0"/>
                   </pic:nvPicPr>
                   <pic:blipFill>
@@ -206,7 +206,7 @@
     </w:p>
     <w:sdt>
       <w:sdtPr>
-        <w:id w:val="-772247985"/>
+        <w:id w:val="-737070842"/>
         <w:docPartObj>
           <w:docPartGallery w:val="Table of Contents"/>
           <w:docPartUnique w:val="1"/>
@@ -1197,12 +1197,12 @@
           <wp:inline distB="114300" distT="114300" distL="114300" distR="114300">
             <wp:extent cx="5731200" cy="3429000"/>
             <wp:effectExtent b="0" l="0" r="0" t="0"/>
-            <wp:docPr id="5" name="image8.png"/>
+            <wp:docPr id="3" name="image1.png"/>
             <a:graphic>
               <a:graphicData uri="http://schemas.openxmlformats.org/drawingml/2006/picture">
                 <pic:pic>
                   <pic:nvPicPr>
-                    <pic:cNvPr id="0" name="image8.png"/>
+                    <pic:cNvPr id="0" name="image1.png"/>
                     <pic:cNvPicPr preferRelativeResize="0"/>
                   </pic:nvPicPr>
                   <pic:blipFill>
@@ -1348,14 +1348,14 @@
         </w:rPr>
         <w:drawing>
           <wp:inline distB="114300" distT="114300" distL="114300" distR="114300">
-            <wp:extent cx="5731200" cy="2705100"/>
+            <wp:extent cx="5731200" cy="3225800"/>
             <wp:effectExtent b="0" l="0" r="0" t="0"/>
-            <wp:docPr id="3" name="image6.png"/>
+            <wp:docPr id="10" name="image8.png"/>
             <a:graphic>
               <a:graphicData uri="http://schemas.openxmlformats.org/drawingml/2006/picture">
                 <pic:pic>
                   <pic:nvPicPr>
-                    <pic:cNvPr id="0" name="image6.png"/>
+                    <pic:cNvPr id="0" name="image8.png"/>
                     <pic:cNvPicPr preferRelativeResize="0"/>
                   </pic:nvPicPr>
                   <pic:blipFill>
@@ -1368,7 +1368,7 @@
                   <pic:spPr>
                     <a:xfrm>
                       <a:off x="0" y="0"/>
-                      <a:ext cx="5731200" cy="2705100"/>
+                      <a:ext cx="5731200" cy="3225800"/>
                     </a:xfrm>
                     <a:prstGeom prst="rect"/>
                     <a:ln/>
@@ -1608,12 +1608,12 @@
           <wp:inline distB="114300" distT="114300" distL="114300" distR="114300">
             <wp:extent cx="5731200" cy="2692400"/>
             <wp:effectExtent b="0" l="0" r="0" t="0"/>
-            <wp:docPr id="11" name="image9.png"/>
+            <wp:docPr id="11" name="image5.png"/>
             <a:graphic>
               <a:graphicData uri="http://schemas.openxmlformats.org/drawingml/2006/picture">
                 <pic:pic>
                   <pic:nvPicPr>
-                    <pic:cNvPr id="0" name="image9.png"/>
+                    <pic:cNvPr id="0" name="image5.png"/>
                     <pic:cNvPicPr preferRelativeResize="0"/>
                   </pic:nvPicPr>
                   <pic:blipFill>
@@ -1768,14 +1768,14 @@
         </w:rPr>
         <w:drawing>
           <wp:inline distB="114300" distT="114300" distL="114300" distR="114300">
-            <wp:extent cx="5731200" cy="2705100"/>
+            <wp:extent cx="5731200" cy="3225800"/>
             <wp:effectExtent b="0" l="0" r="0" t="0"/>
-            <wp:docPr id="2" name="image11.png"/>
+            <wp:docPr id="4" name="image10.png"/>
             <a:graphic>
               <a:graphicData uri="http://schemas.openxmlformats.org/drawingml/2006/picture">
                 <pic:pic>
                   <pic:nvPicPr>
-                    <pic:cNvPr id="0" name="image11.png"/>
+                    <pic:cNvPr id="0" name="image10.png"/>
                     <pic:cNvPicPr preferRelativeResize="0"/>
                   </pic:nvPicPr>
                   <pic:blipFill>
@@ -1788,7 +1788,7 @@
                   <pic:spPr>
                     <a:xfrm>
                       <a:off x="0" y="0"/>
-                      <a:ext cx="5731200" cy="2705100"/>
+                      <a:ext cx="5731200" cy="3225800"/>
                     </a:xfrm>
                     <a:prstGeom prst="rect"/>
                     <a:ln/>
@@ -1875,12 +1875,12 @@
           <wp:inline distB="114300" distT="114300" distL="114300" distR="114300">
             <wp:extent cx="5731200" cy="2667000"/>
             <wp:effectExtent b="0" l="0" r="0" t="0"/>
-            <wp:docPr id="6" name="image3.png"/>
+            <wp:docPr id="5" name="image4.png"/>
             <a:graphic>
               <a:graphicData uri="http://schemas.openxmlformats.org/drawingml/2006/picture">
                 <pic:pic>
                   <pic:nvPicPr>
-                    <pic:cNvPr id="0" name="image3.png"/>
+                    <pic:cNvPr id="0" name="image4.png"/>
                     <pic:cNvPicPr preferRelativeResize="0"/>
                   </pic:nvPicPr>
                   <pic:blipFill>
@@ -2003,12 +2003,12 @@
           <wp:inline distB="114300" distT="114300" distL="114300" distR="114300">
             <wp:extent cx="5731200" cy="2971800"/>
             <wp:effectExtent b="0" l="0" r="0" t="0"/>
-            <wp:docPr id="1" name="image4.png"/>
+            <wp:docPr id="1" name="image2.png"/>
             <a:graphic>
               <a:graphicData uri="http://schemas.openxmlformats.org/drawingml/2006/picture">
                 <pic:pic>
                   <pic:nvPicPr>
-                    <pic:cNvPr id="0" name="image4.png"/>
+                    <pic:cNvPr id="0" name="image2.png"/>
                     <pic:cNvPicPr preferRelativeResize="0"/>
                   </pic:nvPicPr>
                   <pic:blipFill>
@@ -2158,12 +2158,12 @@
           <wp:inline distB="114300" distT="114300" distL="114300" distR="114300">
             <wp:extent cx="5731200" cy="2552700"/>
             <wp:effectExtent b="0" l="0" r="0" t="0"/>
-            <wp:docPr id="8" name="image10.png"/>
+            <wp:docPr id="7" name="image9.png"/>
             <a:graphic>
               <a:graphicData uri="http://schemas.openxmlformats.org/drawingml/2006/picture">
                 <pic:pic>
                   <pic:nvPicPr>
-                    <pic:cNvPr id="0" name="image10.png"/>
+                    <pic:cNvPr id="0" name="image9.png"/>
                     <pic:cNvPicPr preferRelativeResize="0"/>
                   </pic:nvPicPr>
                   <pic:blipFill>
@@ -2374,12 +2374,12 @@
           <wp:inline distB="114300" distT="114300" distL="114300" distR="114300">
             <wp:extent cx="5731200" cy="2209800"/>
             <wp:effectExtent b="0" l="0" r="0" t="0"/>
-            <wp:docPr id="10" name="image1.png"/>
+            <wp:docPr id="9" name="image3.png"/>
             <a:graphic>
               <a:graphicData uri="http://schemas.openxmlformats.org/drawingml/2006/picture">
                 <pic:pic>
                   <pic:nvPicPr>
-                    <pic:cNvPr id="0" name="image1.png"/>
+                    <pic:cNvPr id="0" name="image3.png"/>
                     <pic:cNvPicPr preferRelativeResize="0"/>
                   </pic:nvPicPr>
                   <pic:blipFill>
@@ -2465,12 +2465,12 @@
           <wp:inline distB="114300" distT="114300" distL="114300" distR="114300">
             <wp:extent cx="5731200" cy="2044700"/>
             <wp:effectExtent b="0" l="0" r="0" t="0"/>
-            <wp:docPr id="9" name="image7.png"/>
+            <wp:docPr id="8" name="image11.png"/>
             <a:graphic>
               <a:graphicData uri="http://schemas.openxmlformats.org/drawingml/2006/picture">
                 <pic:pic>
                   <pic:nvPicPr>
-                    <pic:cNvPr id="0" name="image7.png"/>
+                    <pic:cNvPr id="0" name="image11.png"/>
                     <pic:cNvPicPr preferRelativeResize="0"/>
                   </pic:nvPicPr>
                   <pic:blipFill>
@@ -2981,12 +2981,12 @@
           <wp:extent cx="1366838" cy="499301"/>
           <wp:effectExtent b="0" l="0" r="0" t="0"/>
           <wp:wrapNone/>
-          <wp:docPr id="7" name="image2.png"/>
+          <wp:docPr id="6" name="image7.png"/>
           <a:graphic>
             <a:graphicData uri="http://schemas.openxmlformats.org/drawingml/2006/picture">
               <pic:pic>
                 <pic:nvPicPr>
-                  <pic:cNvPr id="0" name="image2.png"/>
+                  <pic:cNvPr id="0" name="image7.png"/>
                   <pic:cNvPicPr preferRelativeResize="0"/>
                 </pic:nvPicPr>
                 <pic:blipFill>

</xml_diff>